<commit_message>
Refresh AquiferOpenBibleDictionary content for 2026-09-30 release
</commit_message>
<xml_diff>
--- a/arb/docx/005.content.docx
+++ b/arb/docx/005.content.docx
@@ -15036,6 +15036,137 @@
           <w:lang w:val="ar_AE" w:bidi="ar_AE"/>
         </w:rPr>
         <w:t>).</w:t>
+      </w:r>
+    </w:p>
+    <w:p>
+      <w:pPr>
+        <w:pStyle w:val="Heading3"/>
+        <w:bidi/>
+      </w:pPr>
+      <w:r>
+        <w:rPr>
+          <w:rtl/>
+          <w:cs/>
+          <w:lang w:val="ar_AE" w:bidi="ar_AE"/>
+        </w:rPr>
+        <w:t>موقع مُوَقَّر: جبل الزيتون</w:t>
+      </w:r>
+    </w:p>
+    <w:p>
+      <w:pPr>
+        <w:bidi/>
+      </w:pPr>
+      <w:r>
+        <w:rPr>
+          <w:rtl/>
+          <w:cs/>
+          <w:lang w:val="ar_AE" w:bidi="ar_AE"/>
+        </w:rPr>
+      </w:r>
+      <w:r>
+        <w:rPr>
+          <w:rtl/>
+          <w:cs/>
+          <w:lang w:val="ar_AE" w:bidi="ar_AE"/>
+        </w:rPr>
+        <w:t>صار جبل الزيتون سريعًا مركزًا للتقوى المسيحية. وفي العصر البيزنطي كان على الجبل أربع وعشرون كنيسة يخدمها عدد كبير من الرهبان والراهبات. وكانت كنيسة قسطنطين تتصدَّر القمة، إحياءً لذكرى صعود المسيح. بل إن الجبل صار في القرن الرابع المدفن المعتاد لأساقفة أورشليم.</w:t>
+      </w:r>
+    </w:p>
+    <w:p>
+      <w:pPr>
+        <w:bidi/>
+      </w:pPr>
+      <w:r>
+        <w:rPr>
+          <w:rtl/>
+          <w:cs/>
+          <w:lang w:val="ar_AE" w:bidi="ar_AE"/>
+        </w:rPr>
+      </w:r>
+      <w:r>
+        <w:rPr>
+          <w:rtl/>
+          <w:cs/>
+          <w:lang w:val="ar_AE" w:bidi="ar_AE"/>
+        </w:rPr>
+        <w:t>ويُوَقِّر اليهود والمسلمون هذا الموقع كذلك، لأنه سيكون موضع الدينونة. فبحسب التلمود، سيقوم الأبرار بين أورشليم وجبل الزيتون. وهذا يفسِّر اتساع المقابر الإسلامية واليهودية، ولا سيما على المنحدر الغربي من جبل الزيتون. فالمسيحي واليهودي والمسلم جميعًا ينظرون إلى جبل الزيتون بوصفه النقطة المحورية ليوم الرب الأخير.</w:t>
+      </w:r>
+    </w:p>
+    <w:p>
+      <w:pPr>
+        <w:bidi/>
+      </w:pPr>
+      <w:r>
+        <w:rPr>
+          <w:rtl/>
+          <w:cs/>
+          <w:lang w:val="ar_AE" w:bidi="ar_AE"/>
+        </w:rPr>
+      </w:r>
+      <w:r>
+        <w:rPr>
+          <w:rtl/>
+          <w:cs/>
+          <w:lang w:val="ar_AE" w:bidi="ar_AE"/>
+        </w:rPr>
+        <w:t xml:space="preserve">سرعان ما أصبح </w:t>
+      </w:r>
+      <w:r>
+        <w:rPr>
+          <w:b/>
+          <w:rtl/>
+          <w:cs/>
+          <w:lang w:val="ar_AE" w:bidi="ar_AE"/>
+        </w:rPr>
+        <w:t>جبل الزيتون</w:t>
+      </w:r>
+      <w:r>
+        <w:rPr>
+          <w:rtl/>
+          <w:cs/>
+          <w:lang w:val="ar_AE" w:bidi="ar_AE"/>
+        </w:rPr>
+        <w:t xml:space="preserve"> مكانًا مهمًّا للعبادة المسيحية. ففي العصر البيزنطي، أي زمن الإمبراطورية الرومانية الشرقية، كان على الجبل 24 كنيسة، كما عاش فيه كثير من الرهبان والراهبات. وكانت هناك كنيسة بناها الإمبراطور قسطنطين على قمة الجبل تكريمًا لصعود المسيح، حين عاد إلى السماء. وبحلول القرن الرابع، كان أساقفة أورشليم يُدفنون هناك أيضًا في كثير من الأحيان.</w:t>
+      </w:r>
+    </w:p>
+    <w:p>
+      <w:pPr>
+        <w:bidi/>
+      </w:pPr>
+      <w:r>
+        <w:rPr>
+          <w:rtl/>
+          <w:cs/>
+          <w:lang w:val="ar_AE" w:bidi="ar_AE"/>
+        </w:rPr>
+      </w:r>
+      <w:r>
+        <w:rPr>
+          <w:rtl/>
+          <w:cs/>
+          <w:lang w:val="ar_AE" w:bidi="ar_AE"/>
+        </w:rPr>
+        <w:t>كما يكرّم اليهود والمسلمون جبل الزيتون لأنهم يعتقدون أنه سيكون مرتبطًا بالدينونة الأخيرة. ووفقًا للتلمود، وهو أحد النصوص الدينية اليهودية المهمة، سيقوم الأبرار من الموت في المنطقة الواقعة بين أورشليم وجبل الزيتون. ويساعد هذا الاعتقاد على تفسير وجود المقابر اليهودية والإسلامية الكبيرة هناك، ولا سيما على السفح الغربي للجبل.</w:t>
+      </w:r>
+    </w:p>
+    <w:p>
+      <w:pPr>
+        <w:bidi/>
+      </w:pPr>
+      <w:r>
+        <w:rPr>
+          <w:rtl/>
+          <w:cs/>
+          <w:lang w:val="ar_AE" w:bidi="ar_AE"/>
+        </w:rPr>
+      </w:r>
+      <w:r>
+        <w:rPr>
+          <w:rtl/>
+          <w:cs/>
+          <w:lang w:val="ar_AE" w:bidi="ar_AE"/>
+        </w:rPr>
+        <w:t>ويربط المسيحيون واليهود والمسلمون جميعًا جبل الزيتون بيوم الرب الأخير، أي الوقت الذي سيدين فيه الله العالم.</w:t>
       </w:r>
       <w:r>
         <w:rPr>

</xml_diff>